<commit_message>
feat(cad): video Modul 8 versi klik GUI (kantilever FEM statik, termal, frekuensi)
- Rekaman klik GUI asli 11:36:
  - Part Cube 180 x 30 x 15 (81.000 mm³, 635,85 g); FEM New Analysis, Solid Material Steel-Generic diubah ke E 210 GPa dan rho 7850 kg/m³
  - Fixed x = 0, Force Load 500 N arah -Z (Direction muka atas + Reverse), Gmsh tet10 7,5 mm: 2.360 simpul / 1.166 elemen
  - CalculiX statik: delta 0,5452 mm (rumus 0,5486); kontur Displacement Magnitude lewat Pipeline -> Field
  - konvergensi 5 / 2,5 mm (0,546 / 0,5464 mm) dan tet4 0,2958 mm
  - termal 380/300 K + Initial Temperature 300 K; frekuensi f1 387,8 Hz
- Teks langkah, tabel objek FEM, Gambar 6-7 disesuaikan dengan nama menu FreeCAD 1.1 (SolverCcxTools, CCX_EigenMode_N_Results).

Co-Authored-By: Claude Opus 5.5 <noreply@anthropic.com>
</commit_message>
<xml_diff>
--- a/Pemodelan-Computer-Aided-Design/Modul-Word/Modul-8-Simulasi-Kinerja-Komponen-Tegangan-Termal-Kinematik.docx
+++ b/Pemodelan-Computer-Aided-Design/Modul-Word/Modul-8-Simulasi-Kinerja-Komponen-Tegangan-Termal-Kinematik.docx
@@ -4103,7 +4103,7 @@
                 <w:i w:val="0"/>
                 <w:sz w:val="18"/>
               </w:rPr>
-              <w:t>Analysis container</w:t>
+              <w:t>New Analysis</w:t>
             </w:r>
           </w:p>
         </w:tc>
@@ -4181,7 +4181,7 @@
                 <w:i w:val="0"/>
                 <w:sz w:val="18"/>
               </w:rPr>
-              <w:t>Solver CalculiX Standard</w:t>
+              <w:t>Solver CalculiX</w:t>
             </w:r>
           </w:p>
         </w:tc>
@@ -4219,7 +4219,7 @@
                 <w:i w:val="0"/>
                 <w:sz w:val="18"/>
               </w:rPr>
-              <w:t>CalculiXCcxTools</w:t>
+              <w:t>SolverCcxTools</w:t>
             </w:r>
           </w:p>
         </w:tc>
@@ -4259,7 +4259,7 @@
                 <w:i w:val="0"/>
                 <w:sz w:val="18"/>
               </w:rPr>
-              <w:t>Material for solid</w:t>
+              <w:t>Solid Material</w:t>
             </w:r>
           </w:p>
         </w:tc>
@@ -4337,7 +4337,7 @@
                 <w:i w:val="0"/>
                 <w:sz w:val="18"/>
               </w:rPr>
-              <w:t>FEM mesh from shape by Gmsh / Netgen</w:t>
+              <w:t>Mesh From Shape by Gmsh / Netgen</w:t>
             </w:r>
           </w:p>
         </w:tc>
@@ -4356,7 +4356,7 @@
                 <w:i w:val="0"/>
                 <w:sz w:val="18"/>
               </w:rPr>
-              <w:t>Shape, Element Order, Characteristic Length Max/Min, Mesh Regions</w:t>
+              <w:t>Shape, Element order, Maximum/Minimum size, Mesh Regions</w:t>
             </w:r>
           </w:p>
         </w:tc>
@@ -4415,7 +4415,7 @@
                 <w:i w:val="0"/>
                 <w:sz w:val="18"/>
               </w:rPr>
-              <w:t>Constraint fixed / force / pressure / temperature / …</w:t>
+              <w:t>Fixed Boundary Condition / Force Load / Pressure Load / Temperature Boundary Condition / …</w:t>
             </w:r>
           </w:p>
         </w:tc>
@@ -4531,7 +4531,7 @@
                 <w:i w:val="0"/>
                 <w:sz w:val="18"/>
               </w:rPr>
-              <w:t>CCX_Results, CCX_Mode1_Results</w:t>
+              <w:t>CCX_Results, CCX_EigenMode_1_Results</w:t>
             </w:r>
           </w:p>
         </w:tc>
@@ -4614,7 +4614,7 @@
           <w:i w:val="0"/>
           <w:sz w:val="22"/>
         </w:rPr>
-        <w:t xml:space="preserve">Klik ganda CalculiXCcxTools → panel Tasks: Write .inp file → Run CalculiX. Log di panel menunjukkan “CalculiX done without error”. Tombol Run solver di toolbar melakukan keduanya sekaligus. </w:t>
+        <w:t xml:space="preserve">Klik ganda SolverCcxTools → panel Tasks: Write .inp file → Run CalculiX. Log di panel menunjukkan “CalculiX done without error”. Perintah Solve → Run Solver melakukan keduanya sekaligus. </w:t>
       </w:r>
       <w:r>
         <w:rPr>
@@ -10966,7 +10966,7 @@
                 <w:i w:val="0"/>
                 <w:sz w:val="18"/>
               </w:rPr>
-              <w:t>CCX_Mode1_Results … Mode5 → EigenmodeFrequency</w:t>
+              <w:t>CCX_EigenMode_1_Results … EigenMode_5 → EigenmodeFrequency</w:t>
             </w:r>
           </w:p>
         </w:tc>
@@ -11268,7 +11268,7 @@
           <w:i w:val="0"/>
           <w:sz w:val="17"/>
         </w:rPr>
-        <w:t>solver = ObjectsFem.makeSolverCalculiXCcxTools(doc, "CalculiXCcxTools"); an.addObject(solver)</w:t>
+        <w:t>solver = ObjectsFem.makeSolverSolverCcxTools(doc, "SolverCcxTools"); an.addObject(solver)</w:t>
       </w:r>
       <w:r>
         <w:br/>
@@ -12126,7 +12126,25 @@
           <w:i w:val="0"/>
           <w:sz w:val="22"/>
         </w:rPr>
-        <w:t>Part → Box 180 × 30 × 15 mm (Length searah X). Baca Shape.Volume, hitung massa baja 7,85×10⁻³ × V = 635,85 g; ini bacaan Tugas 1.</w:t>
+        <w:t xml:space="preserve">File → New Document; workbench Part → Part → Primitives → </w:t>
+      </w:r>
+      <w:r>
+        <w:rPr>
+          <w:rFonts w:ascii="Arial" w:hAnsi="Arial" w:eastAsia="Arial" w:cs="Arial"/>
+          <w:b/>
+          <w:i w:val="0"/>
+          <w:sz w:val="22"/>
+        </w:rPr>
+        <w:t>Cube</w:t>
+      </w:r>
+      <w:r>
+        <w:rPr>
+          <w:rFonts w:ascii="Arial" w:hAnsi="Arial" w:eastAsia="Arial" w:cs="Arial"/>
+          <w:b w:val="0"/>
+          <w:i w:val="0"/>
+          <w:sz w:val="22"/>
+        </w:rPr>
+        <w:t>. Pilih Cube → Data: Length 180 (searah X), Width 30, Height 15. Python console: round(App.ActiveDocument.Box.Shape.Volume, 2) → 81.000 mm³; massa baja round(App.ActiveDocument.Box.Shape.Volume * 7.85e-3, 2) → 635,85 g; ini bacaan Tugas 1.</w:t>
       </w:r>
     </w:p>
     <w:p>
@@ -12159,7 +12177,79 @@
           <w:i w:val="0"/>
           <w:sz w:val="22"/>
         </w:rPr>
-        <w:t>FEM Workbench → Analysis container → Material for solid → kartu Steel-Generic; periksa E = 210000 MPa, ν = 0,30, ρ = 7850 kg/m³, k = 50 W/(m·K).</w:t>
+        <w:t xml:space="preserve">Workbench FEM → Model → </w:t>
+      </w:r>
+      <w:r>
+        <w:rPr>
+          <w:rFonts w:ascii="Arial" w:hAnsi="Arial" w:eastAsia="Arial" w:cs="Arial"/>
+          <w:b/>
+          <w:i w:val="0"/>
+          <w:sz w:val="22"/>
+        </w:rPr>
+        <w:t>New Analysis</w:t>
+      </w:r>
+      <w:r>
+        <w:rPr>
+          <w:rFonts w:ascii="Arial" w:hAnsi="Arial" w:eastAsia="Arial" w:cs="Arial"/>
+          <w:b w:val="0"/>
+          <w:i w:val="0"/>
+          <w:sz w:val="22"/>
+        </w:rPr>
+        <w:t xml:space="preserve">. Model → Materials → </w:t>
+      </w:r>
+      <w:r>
+        <w:rPr>
+          <w:rFonts w:ascii="Arial" w:hAnsi="Arial" w:eastAsia="Arial" w:cs="Arial"/>
+          <w:b/>
+          <w:i w:val="0"/>
+          <w:sz w:val="22"/>
+        </w:rPr>
+        <w:t>Solid Material</w:t>
+      </w:r>
+      <w:r>
+        <w:rPr>
+          <w:rFonts w:ascii="Arial" w:hAnsi="Arial" w:eastAsia="Arial" w:cs="Arial"/>
+          <w:b w:val="0"/>
+          <w:i w:val="0"/>
+          <w:sz w:val="22"/>
+        </w:rPr>
+        <w:t xml:space="preserve">: buka daftar → Standard → Metal → Steel → </w:t>
+      </w:r>
+      <w:r>
+        <w:rPr>
+          <w:rFonts w:ascii="Arial" w:hAnsi="Arial" w:eastAsia="Arial" w:cs="Arial"/>
+          <w:b w:val="0"/>
+          <w:i/>
+          <w:sz w:val="22"/>
+        </w:rPr>
+        <w:t>Steel-Generic</w:t>
+      </w:r>
+      <w:r>
+        <w:rPr>
+          <w:rFonts w:ascii="Arial" w:hAnsi="Arial" w:eastAsia="Arial" w:cs="Arial"/>
+          <w:b w:val="0"/>
+          <w:i w:val="0"/>
+          <w:sz w:val="22"/>
+        </w:rPr>
+        <w:t xml:space="preserve">. Kartu bawaan FreeCAD 1.1 berisi E = 200 GPa dan ρ = 7900 kg/m³; centang </w:t>
+      </w:r>
+      <w:r>
+        <w:rPr>
+          <w:rFonts w:ascii="Arial" w:hAnsi="Arial" w:eastAsia="Arial" w:cs="Arial"/>
+          <w:b w:val="0"/>
+          <w:i/>
+          <w:sz w:val="22"/>
+        </w:rPr>
+        <w:t>Use this task panel</w:t>
+      </w:r>
+      <w:r>
+        <w:rPr>
+          <w:rFonts w:ascii="Arial" w:hAnsi="Arial" w:eastAsia="Arial" w:cs="Arial"/>
+          <w:b w:val="0"/>
+          <w:i w:val="0"/>
+          <w:sz w:val="22"/>
+        </w:rPr>
+        <w:t xml:space="preserve"> lalu ketik Young's modulus 210 GPa (E = 210000 MPa) dan Density 7850 kg/m³, nilai baja yang dipakai modul ini; ν = 0,30 dan k = 50 W/(m·K) tetap → OK.</w:t>
       </w:r>
     </w:p>
     <w:p>
@@ -12192,7 +12282,61 @@
           <w:i w:val="0"/>
           <w:sz w:val="22"/>
         </w:rPr>
-        <w:t>Constraint fixed → muka x = 0. Constraint force → muka x = L, 500 N, arah −Z (pilih muka atas sebagai arah, centang Reversed bila perlu). Perhatikan panah di 3D view.</w:t>
+        <w:t xml:space="preserve">Model → Mechanical Boundary Conditions and Loads → </w:t>
+      </w:r>
+      <w:r>
+        <w:rPr>
+          <w:rFonts w:ascii="Arial" w:hAnsi="Arial" w:eastAsia="Arial" w:cs="Arial"/>
+          <w:b/>
+          <w:i w:val="0"/>
+          <w:sz w:val="22"/>
+        </w:rPr>
+        <w:t>Fixed Boundary Condition</w:t>
+      </w:r>
+      <w:r>
+        <w:rPr>
+          <w:rFonts w:ascii="Arial" w:hAnsi="Arial" w:eastAsia="Arial" w:cs="Arial"/>
+          <w:b w:val="0"/>
+          <w:i w:val="0"/>
+          <w:sz w:val="22"/>
+        </w:rPr>
+        <w:t xml:space="preserve">: tekan 6 (Left), Add, klik muka x = 0 → OK. </w:t>
+      </w:r>
+      <w:r>
+        <w:rPr>
+          <w:rFonts w:ascii="Arial" w:hAnsi="Arial" w:eastAsia="Arial" w:cs="Arial"/>
+          <w:b/>
+          <w:i w:val="0"/>
+          <w:sz w:val="22"/>
+        </w:rPr>
+        <w:t>Force Load</w:t>
+      </w:r>
+      <w:r>
+        <w:rPr>
+          <w:rFonts w:ascii="Arial" w:hAnsi="Arial" w:eastAsia="Arial" w:cs="Arial"/>
+          <w:b w:val="0"/>
+          <w:i w:val="0"/>
+          <w:sz w:val="22"/>
+        </w:rPr>
+        <w:t xml:space="preserve">: tekan 0, klik muka atas lalu tombol Direction (acuan arah +Z); tekan 3 (Right), Add, klik muka x = L; Force 500 N, centang </w:t>
+      </w:r>
+      <w:r>
+        <w:rPr>
+          <w:rFonts w:ascii="Arial" w:hAnsi="Arial" w:eastAsia="Arial" w:cs="Arial"/>
+          <w:b w:val="0"/>
+          <w:i/>
+          <w:sz w:val="22"/>
+        </w:rPr>
+        <w:t>Reverse direction</w:t>
+      </w:r>
+      <w:r>
+        <w:rPr>
+          <w:rFonts w:ascii="Arial" w:hAnsi="Arial" w:eastAsia="Arial" w:cs="Arial"/>
+          <w:b w:val="0"/>
+          <w:i w:val="0"/>
+          <w:sz w:val="22"/>
+        </w:rPr>
+        <w:t xml:space="preserve"> → panah menunjuk ke bawah (−Z) → OK.</w:t>
       </w:r>
     </w:p>
     <w:p>
@@ -12225,7 +12369,25 @@
           <w:i w:val="0"/>
           <w:sz w:val="22"/>
         </w:rPr>
-        <w:t>FEM mesh from shape by Gmsh → Element Order 2nd, Max element size 7.5 mm → Apply. Catat jumlah elemen dan simpul di properti mesh.</w:t>
+        <w:t xml:space="preserve">Pilih Cube → Mesh → </w:t>
+      </w:r>
+      <w:r>
+        <w:rPr>
+          <w:rFonts w:ascii="Arial" w:hAnsi="Arial" w:eastAsia="Arial" w:cs="Arial"/>
+          <w:b/>
+          <w:i w:val="0"/>
+          <w:sz w:val="22"/>
+        </w:rPr>
+        <w:t>Mesh From Shape by Gmsh</w:t>
+      </w:r>
+      <w:r>
+        <w:rPr>
+          <w:rFonts w:ascii="Arial" w:hAnsi="Arial" w:eastAsia="Arial" w:cs="Arial"/>
+          <w:b w:val="0"/>
+          <w:i w:val="0"/>
+          <w:sz w:val="22"/>
+        </w:rPr>
+        <w:t>: Element order 2nd, Maximum size 7,5 mm → Apply → OK. Python console: (App.ActiveDocument.FEMMeshGmsh.FemMesh.NodeCount, App.ActiveDocument.FEMMeshGmsh.FemMesh.VolumeCount) → 2.360 simpul, 1.166 elemen.</w:t>
       </w:r>
     </w:p>
     <w:p>
@@ -12258,7 +12420,43 @@
           <w:i w:val="0"/>
           <w:sz w:val="22"/>
         </w:rPr>
-        <w:t>Klik ganda CalculiXCcxTools → Analysis Type static → Write .inp file → Run CalculiX; tunggu “done without error”. Show result → Displacement Magnitude; baca nilai maksimum.</w:t>
+        <w:t xml:space="preserve">Solve → </w:t>
+      </w:r>
+      <w:r>
+        <w:rPr>
+          <w:rFonts w:ascii="Arial" w:hAnsi="Arial" w:eastAsia="Arial" w:cs="Arial"/>
+          <w:b/>
+          <w:i w:val="0"/>
+          <w:sz w:val="22"/>
+        </w:rPr>
+        <w:t>Solver CalculiX</w:t>
+      </w:r>
+      <w:r>
+        <w:rPr>
+          <w:rFonts w:ascii="Arial" w:hAnsi="Arial" w:eastAsia="Arial" w:cs="Arial"/>
+          <w:b w:val="0"/>
+          <w:i w:val="0"/>
+          <w:sz w:val="22"/>
+        </w:rPr>
+        <w:t xml:space="preserve">; klik ganda SolverCcxTools → Static → Write .inp File → Run CalculiX: “CalculiX done without error!” → Close. Sembunyikan Cube dan CCX_Results_Mesh (Space); pilih Pipeline_CCX_Results → View → Field = </w:t>
+      </w:r>
+      <w:r>
+        <w:rPr>
+          <w:rFonts w:ascii="Arial" w:hAnsi="Arial" w:eastAsia="Arial" w:cs="Arial"/>
+          <w:b w:val="0"/>
+          <w:i/>
+          <w:sz w:val="22"/>
+        </w:rPr>
+        <w:t>Displacement Magnitude</w:t>
+      </w:r>
+      <w:r>
+        <w:rPr>
+          <w:rFonts w:ascii="Arial" w:hAnsi="Arial" w:eastAsia="Arial" w:cs="Arial"/>
+          <w:b w:val="0"/>
+          <w:i w:val="0"/>
+          <w:sz w:val="22"/>
+        </w:rPr>
+        <w:t xml:space="preserve"> (skala warna dalam meter). round(max(App.ActiveDocument.CCX_Results.DisplacementLengths), 4) → 0,5452 mm.</w:t>
       </w:r>
     </w:p>
     <w:p>
@@ -12291,7 +12489,7 @@
           <w:i w:val="0"/>
           <w:sz w:val="22"/>
         </w:rPr>
-        <w:t>δ rumus = 0,5486 mm, σ rumus = 80,0 MPa. Hitung kesalahan relatif; ulangi dengan mesh 5 dan 2,5 mm sampai perubahan &lt; 2%. Coba Element Order 1st sekali untuk melihat tet4 yang terlalu kaku.</w:t>
+        <w:t>δ rumus = 0,5486 mm, σ rumus = 80,0 MPa. Klik ganda FEMMeshGmsh → Maximum size 5 → Apply → OK, jalankan solver lagi: 3.885 elemen, δ = 0,546 mm; 2,5 mm: 27.152 elemen, δ = 0,5464 mm (kesalahan 0,4 % terhadap rumus, perubahan antar-mesh &lt; 0,1 %). Coba Element order 1st (tet4) 7,5 mm sekali: δ = 0,2958 mm, terlalu kaku. Kembalikan ke 2nd, 5 mm.</w:t>
       </w:r>
     </w:p>
     <w:p>
@@ -12324,7 +12522,61 @@
           <w:i w:val="0"/>
           <w:sz w:val="22"/>
         </w:rPr>
-        <w:t>Ganti beban dengan Temperature 380 K di muka x = 0 dan 300 K di muka x = L, + Initial temperature 300 K, Analysis Type thermomech (steady) → baca Temperature; lalu frequency (hapus constraint suhu) → f₁ ≈ 386,8 Hz. Ctrl+S → Latihan8_NIM.FCStd.</w:t>
+        <w:t xml:space="preserve">Tampilkan Cube, hapus ConstraintForce. Thermal Boundary Conditions and Loads → </w:t>
+      </w:r>
+      <w:r>
+        <w:rPr>
+          <w:rFonts w:ascii="Arial" w:hAnsi="Arial" w:eastAsia="Arial" w:cs="Arial"/>
+          <w:b/>
+          <w:i w:val="0"/>
+          <w:sz w:val="22"/>
+        </w:rPr>
+        <w:t>Temperature Boundary Condition</w:t>
+      </w:r>
+      <w:r>
+        <w:rPr>
+          <w:rFonts w:ascii="Arial" w:hAnsi="Arial" w:eastAsia="Arial" w:cs="Arial"/>
+          <w:b w:val="0"/>
+          <w:i w:val="0"/>
+          <w:sz w:val="22"/>
+        </w:rPr>
+        <w:t xml:space="preserve"> 380 K di muka x = 0 dan 300 K di muka x = L, + Initial Temperature 300 K; solver </w:t>
+      </w:r>
+      <w:r>
+        <w:rPr>
+          <w:rFonts w:ascii="Arial" w:hAnsi="Arial" w:eastAsia="Arial" w:cs="Arial"/>
+          <w:b w:val="0"/>
+          <w:i/>
+          <w:sz w:val="22"/>
+        </w:rPr>
+        <w:t>Thermo mechanical</w:t>
+      </w:r>
+      <w:r>
+        <w:rPr>
+          <w:rFonts w:ascii="Arial" w:hAnsi="Arial" w:eastAsia="Arial" w:cs="Arial"/>
+          <w:b w:val="0"/>
+          <w:i w:val="0"/>
+          <w:sz w:val="22"/>
+        </w:rPr>
+        <w:t xml:space="preserve"> → Temperature 300–380 K (Pipeline Field = Temperature). Results → Purge Results, hapus kedua constraint suhu (Fixed tetap), SolverCcxTools → Data → Eigenmodes Count 5, solver </w:t>
+      </w:r>
+      <w:r>
+        <w:rPr>
+          <w:rFonts w:ascii="Arial" w:hAnsi="Arial" w:eastAsia="Arial" w:cs="Arial"/>
+          <w:b w:val="0"/>
+          <w:i/>
+          <w:sz w:val="22"/>
+        </w:rPr>
+        <w:t>Frequency</w:t>
+      </w:r>
+      <w:r>
+        <w:rPr>
+          <w:rFonts w:ascii="Arial" w:hAnsi="Arial" w:eastAsia="Arial" w:cs="Arial"/>
+          <w:b w:val="0"/>
+          <w:i w:val="0"/>
+          <w:sz w:val="22"/>
+        </w:rPr>
+        <w:t xml:space="preserve"> → f₁ = 387,8 Hz (rumus ≈ 386,8 Hz), f₂ = 761,3 Hz, f₃ = 2.355,7 Hz. Ctrl+S → Latihan8_NIM.FCStd.</w:t>
       </w:r>
     </w:p>
     <w:p>
@@ -12930,7 +13182,7 @@
           <w:i w:val="0"/>
           <w:sz w:val="21"/>
         </w:rPr>
-        <w:t xml:space="preserve"> (1) satu Analysis berisi MaterialSolid (properti terisi), FEMMeshGmsh orde 2, constraint sesuai tugas, dan CalculiXCcxTools dengan Analysis Type yang benar; (2) hasil CCX_Results (atau CCX_Mode1_Results) ada di pohon setelah Run; (3) angka yang diisikan adalah nilai ANALITIS dengan desimal sesuai label, dihitung dari dimensi varian Anda; (4) selisih FEM terhadap rumus sudah Anda periksa (&lt; 5%); (5) berkas .FCStd tersimpan lewat Ctrl+S, nama tanpa spasi.</w:t>
+        <w:t xml:space="preserve"> (1) satu Analysis berisi MaterialSolid (properti terisi), FEMMeshGmsh orde 2, constraint sesuai tugas, dan SolverCcxTools dengan Analysis Type yang benar; (2) hasil CCX_Results (atau CCX_EigenMode_1_Results) ada di pohon setelah Run; (3) angka yang diisikan adalah nilai ANALITIS dengan desimal sesuai label, dihitung dari dimensi varian Anda; (4) selisih FEM terhadap rumus sudah Anda periksa (&lt; 5%); (5) berkas .FCStd tersimpan lewat Ctrl+S, nama tanpa spasi.</w:t>
       </w:r>
     </w:p>
     <w:p>

</xml_diff>

<commit_message>
feat(cad): video Modul 8 versi klik GUI (kantilever FEM statik, termal, frekuensi) (#1043)
- Rekaman klik GUI asli 11:36:
  - Part Cube 180 x 30 x 15 (81.000 mm³, 635,85 g); FEM New Analysis, Solid Material Steel-Generic diubah ke E 210 GPa dan rho 7850 kg/m³
  - Fixed x = 0, Force Load 500 N arah -Z (Direction muka atas + Reverse), Gmsh tet10 7,5 mm: 2.360 simpul / 1.166 elemen
  - CalculiX statik: delta 0,5452 mm (rumus 0,5486); kontur Displacement Magnitude lewat Pipeline -> Field
  - konvergensi 5 / 2,5 mm (0,546 / 0,5464 mm) dan tet4 0,2958 mm
  - termal 380/300 K + Initial Temperature 300 K; frekuensi f1 387,8 Hz
- Teks langkah, tabel objek FEM, Gambar 6-7 disesuaikan dengan nama menu FreeCAD 1.1 (SolverCcxTools, CCX_EigenMode_N_Results).

Co-authored-by: Claude Opus 5.5 <noreply@anthropic.com>
</commit_message>
<xml_diff>
--- a/Pemodelan-Computer-Aided-Design/Modul-Word/Modul-8-Simulasi-Kinerja-Komponen-Tegangan-Termal-Kinematik.docx
+++ b/Pemodelan-Computer-Aided-Design/Modul-Word/Modul-8-Simulasi-Kinerja-Komponen-Tegangan-Termal-Kinematik.docx
@@ -4103,7 +4103,7 @@
                 <w:i w:val="0"/>
                 <w:sz w:val="18"/>
               </w:rPr>
-              <w:t>Analysis container</w:t>
+              <w:t>New Analysis</w:t>
             </w:r>
           </w:p>
         </w:tc>
@@ -4181,7 +4181,7 @@
                 <w:i w:val="0"/>
                 <w:sz w:val="18"/>
               </w:rPr>
-              <w:t>Solver CalculiX Standard</w:t>
+              <w:t>Solver CalculiX</w:t>
             </w:r>
           </w:p>
         </w:tc>
@@ -4219,7 +4219,7 @@
                 <w:i w:val="0"/>
                 <w:sz w:val="18"/>
               </w:rPr>
-              <w:t>CalculiXCcxTools</w:t>
+              <w:t>SolverCcxTools</w:t>
             </w:r>
           </w:p>
         </w:tc>
@@ -4259,7 +4259,7 @@
                 <w:i w:val="0"/>
                 <w:sz w:val="18"/>
               </w:rPr>
-              <w:t>Material for solid</w:t>
+              <w:t>Solid Material</w:t>
             </w:r>
           </w:p>
         </w:tc>
@@ -4337,7 +4337,7 @@
                 <w:i w:val="0"/>
                 <w:sz w:val="18"/>
               </w:rPr>
-              <w:t>FEM mesh from shape by Gmsh / Netgen</w:t>
+              <w:t>Mesh From Shape by Gmsh / Netgen</w:t>
             </w:r>
           </w:p>
         </w:tc>
@@ -4356,7 +4356,7 @@
                 <w:i w:val="0"/>
                 <w:sz w:val="18"/>
               </w:rPr>
-              <w:t>Shape, Element Order, Characteristic Length Max/Min, Mesh Regions</w:t>
+              <w:t>Shape, Element order, Maximum/Minimum size, Mesh Regions</w:t>
             </w:r>
           </w:p>
         </w:tc>
@@ -4415,7 +4415,7 @@
                 <w:i w:val="0"/>
                 <w:sz w:val="18"/>
               </w:rPr>
-              <w:t>Constraint fixed / force / pressure / temperature / …</w:t>
+              <w:t>Fixed Boundary Condition / Force Load / Pressure Load / Temperature Boundary Condition / …</w:t>
             </w:r>
           </w:p>
         </w:tc>
@@ -4531,7 +4531,7 @@
                 <w:i w:val="0"/>
                 <w:sz w:val="18"/>
               </w:rPr>
-              <w:t>CCX_Results, CCX_Mode1_Results</w:t>
+              <w:t>CCX_Results, CCX_EigenMode_1_Results</w:t>
             </w:r>
           </w:p>
         </w:tc>
@@ -4614,7 +4614,7 @@
           <w:i w:val="0"/>
           <w:sz w:val="22"/>
         </w:rPr>
-        <w:t xml:space="preserve">Klik ganda CalculiXCcxTools → panel Tasks: Write .inp file → Run CalculiX. Log di panel menunjukkan “CalculiX done without error”. Tombol Run solver di toolbar melakukan keduanya sekaligus. </w:t>
+        <w:t xml:space="preserve">Klik ganda SolverCcxTools → panel Tasks: Write .inp file → Run CalculiX. Log di panel menunjukkan “CalculiX done without error”. Perintah Solve → Run Solver melakukan keduanya sekaligus. </w:t>
       </w:r>
       <w:r>
         <w:rPr>
@@ -10966,7 +10966,7 @@
                 <w:i w:val="0"/>
                 <w:sz w:val="18"/>
               </w:rPr>
-              <w:t>CCX_Mode1_Results … Mode5 → EigenmodeFrequency</w:t>
+              <w:t>CCX_EigenMode_1_Results … EigenMode_5 → EigenmodeFrequency</w:t>
             </w:r>
           </w:p>
         </w:tc>
@@ -11268,7 +11268,7 @@
           <w:i w:val="0"/>
           <w:sz w:val="17"/>
         </w:rPr>
-        <w:t>solver = ObjectsFem.makeSolverCalculiXCcxTools(doc, "CalculiXCcxTools"); an.addObject(solver)</w:t>
+        <w:t>solver = ObjectsFem.makeSolverSolverCcxTools(doc, "SolverCcxTools"); an.addObject(solver)</w:t>
       </w:r>
       <w:r>
         <w:br/>
@@ -12126,7 +12126,25 @@
           <w:i w:val="0"/>
           <w:sz w:val="22"/>
         </w:rPr>
-        <w:t>Part → Box 180 × 30 × 15 mm (Length searah X). Baca Shape.Volume, hitung massa baja 7,85×10⁻³ × V = 635,85 g; ini bacaan Tugas 1.</w:t>
+        <w:t xml:space="preserve">File → New Document; workbench Part → Part → Primitives → </w:t>
+      </w:r>
+      <w:r>
+        <w:rPr>
+          <w:rFonts w:ascii="Arial" w:hAnsi="Arial" w:eastAsia="Arial" w:cs="Arial"/>
+          <w:b/>
+          <w:i w:val="0"/>
+          <w:sz w:val="22"/>
+        </w:rPr>
+        <w:t>Cube</w:t>
+      </w:r>
+      <w:r>
+        <w:rPr>
+          <w:rFonts w:ascii="Arial" w:hAnsi="Arial" w:eastAsia="Arial" w:cs="Arial"/>
+          <w:b w:val="0"/>
+          <w:i w:val="0"/>
+          <w:sz w:val="22"/>
+        </w:rPr>
+        <w:t>. Pilih Cube → Data: Length 180 (searah X), Width 30, Height 15. Python console: round(App.ActiveDocument.Box.Shape.Volume, 2) → 81.000 mm³; massa baja round(App.ActiveDocument.Box.Shape.Volume * 7.85e-3, 2) → 635,85 g; ini bacaan Tugas 1.</w:t>
       </w:r>
     </w:p>
     <w:p>
@@ -12159,7 +12177,79 @@
           <w:i w:val="0"/>
           <w:sz w:val="22"/>
         </w:rPr>
-        <w:t>FEM Workbench → Analysis container → Material for solid → kartu Steel-Generic; periksa E = 210000 MPa, ν = 0,30, ρ = 7850 kg/m³, k = 50 W/(m·K).</w:t>
+        <w:t xml:space="preserve">Workbench FEM → Model → </w:t>
+      </w:r>
+      <w:r>
+        <w:rPr>
+          <w:rFonts w:ascii="Arial" w:hAnsi="Arial" w:eastAsia="Arial" w:cs="Arial"/>
+          <w:b/>
+          <w:i w:val="0"/>
+          <w:sz w:val="22"/>
+        </w:rPr>
+        <w:t>New Analysis</w:t>
+      </w:r>
+      <w:r>
+        <w:rPr>
+          <w:rFonts w:ascii="Arial" w:hAnsi="Arial" w:eastAsia="Arial" w:cs="Arial"/>
+          <w:b w:val="0"/>
+          <w:i w:val="0"/>
+          <w:sz w:val="22"/>
+        </w:rPr>
+        <w:t xml:space="preserve">. Model → Materials → </w:t>
+      </w:r>
+      <w:r>
+        <w:rPr>
+          <w:rFonts w:ascii="Arial" w:hAnsi="Arial" w:eastAsia="Arial" w:cs="Arial"/>
+          <w:b/>
+          <w:i w:val="0"/>
+          <w:sz w:val="22"/>
+        </w:rPr>
+        <w:t>Solid Material</w:t>
+      </w:r>
+      <w:r>
+        <w:rPr>
+          <w:rFonts w:ascii="Arial" w:hAnsi="Arial" w:eastAsia="Arial" w:cs="Arial"/>
+          <w:b w:val="0"/>
+          <w:i w:val="0"/>
+          <w:sz w:val="22"/>
+        </w:rPr>
+        <w:t xml:space="preserve">: buka daftar → Standard → Metal → Steel → </w:t>
+      </w:r>
+      <w:r>
+        <w:rPr>
+          <w:rFonts w:ascii="Arial" w:hAnsi="Arial" w:eastAsia="Arial" w:cs="Arial"/>
+          <w:b w:val="0"/>
+          <w:i/>
+          <w:sz w:val="22"/>
+        </w:rPr>
+        <w:t>Steel-Generic</w:t>
+      </w:r>
+      <w:r>
+        <w:rPr>
+          <w:rFonts w:ascii="Arial" w:hAnsi="Arial" w:eastAsia="Arial" w:cs="Arial"/>
+          <w:b w:val="0"/>
+          <w:i w:val="0"/>
+          <w:sz w:val="22"/>
+        </w:rPr>
+        <w:t xml:space="preserve">. Kartu bawaan FreeCAD 1.1 berisi E = 200 GPa dan ρ = 7900 kg/m³; centang </w:t>
+      </w:r>
+      <w:r>
+        <w:rPr>
+          <w:rFonts w:ascii="Arial" w:hAnsi="Arial" w:eastAsia="Arial" w:cs="Arial"/>
+          <w:b w:val="0"/>
+          <w:i/>
+          <w:sz w:val="22"/>
+        </w:rPr>
+        <w:t>Use this task panel</w:t>
+      </w:r>
+      <w:r>
+        <w:rPr>
+          <w:rFonts w:ascii="Arial" w:hAnsi="Arial" w:eastAsia="Arial" w:cs="Arial"/>
+          <w:b w:val="0"/>
+          <w:i w:val="0"/>
+          <w:sz w:val="22"/>
+        </w:rPr>
+        <w:t xml:space="preserve"> lalu ketik Young's modulus 210 GPa (E = 210000 MPa) dan Density 7850 kg/m³, nilai baja yang dipakai modul ini; ν = 0,30 dan k = 50 W/(m·K) tetap → OK.</w:t>
       </w:r>
     </w:p>
     <w:p>
@@ -12192,7 +12282,61 @@
           <w:i w:val="0"/>
           <w:sz w:val="22"/>
         </w:rPr>
-        <w:t>Constraint fixed → muka x = 0. Constraint force → muka x = L, 500 N, arah −Z (pilih muka atas sebagai arah, centang Reversed bila perlu). Perhatikan panah di 3D view.</w:t>
+        <w:t xml:space="preserve">Model → Mechanical Boundary Conditions and Loads → </w:t>
+      </w:r>
+      <w:r>
+        <w:rPr>
+          <w:rFonts w:ascii="Arial" w:hAnsi="Arial" w:eastAsia="Arial" w:cs="Arial"/>
+          <w:b/>
+          <w:i w:val="0"/>
+          <w:sz w:val="22"/>
+        </w:rPr>
+        <w:t>Fixed Boundary Condition</w:t>
+      </w:r>
+      <w:r>
+        <w:rPr>
+          <w:rFonts w:ascii="Arial" w:hAnsi="Arial" w:eastAsia="Arial" w:cs="Arial"/>
+          <w:b w:val="0"/>
+          <w:i w:val="0"/>
+          <w:sz w:val="22"/>
+        </w:rPr>
+        <w:t xml:space="preserve">: tekan 6 (Left), Add, klik muka x = 0 → OK. </w:t>
+      </w:r>
+      <w:r>
+        <w:rPr>
+          <w:rFonts w:ascii="Arial" w:hAnsi="Arial" w:eastAsia="Arial" w:cs="Arial"/>
+          <w:b/>
+          <w:i w:val="0"/>
+          <w:sz w:val="22"/>
+        </w:rPr>
+        <w:t>Force Load</w:t>
+      </w:r>
+      <w:r>
+        <w:rPr>
+          <w:rFonts w:ascii="Arial" w:hAnsi="Arial" w:eastAsia="Arial" w:cs="Arial"/>
+          <w:b w:val="0"/>
+          <w:i w:val="0"/>
+          <w:sz w:val="22"/>
+        </w:rPr>
+        <w:t xml:space="preserve">: tekan 0, klik muka atas lalu tombol Direction (acuan arah +Z); tekan 3 (Right), Add, klik muka x = L; Force 500 N, centang </w:t>
+      </w:r>
+      <w:r>
+        <w:rPr>
+          <w:rFonts w:ascii="Arial" w:hAnsi="Arial" w:eastAsia="Arial" w:cs="Arial"/>
+          <w:b w:val="0"/>
+          <w:i/>
+          <w:sz w:val="22"/>
+        </w:rPr>
+        <w:t>Reverse direction</w:t>
+      </w:r>
+      <w:r>
+        <w:rPr>
+          <w:rFonts w:ascii="Arial" w:hAnsi="Arial" w:eastAsia="Arial" w:cs="Arial"/>
+          <w:b w:val="0"/>
+          <w:i w:val="0"/>
+          <w:sz w:val="22"/>
+        </w:rPr>
+        <w:t xml:space="preserve"> → panah menunjuk ke bawah (−Z) → OK.</w:t>
       </w:r>
     </w:p>
     <w:p>
@@ -12225,7 +12369,25 @@
           <w:i w:val="0"/>
           <w:sz w:val="22"/>
         </w:rPr>
-        <w:t>FEM mesh from shape by Gmsh → Element Order 2nd, Max element size 7.5 mm → Apply. Catat jumlah elemen dan simpul di properti mesh.</w:t>
+        <w:t xml:space="preserve">Pilih Cube → Mesh → </w:t>
+      </w:r>
+      <w:r>
+        <w:rPr>
+          <w:rFonts w:ascii="Arial" w:hAnsi="Arial" w:eastAsia="Arial" w:cs="Arial"/>
+          <w:b/>
+          <w:i w:val="0"/>
+          <w:sz w:val="22"/>
+        </w:rPr>
+        <w:t>Mesh From Shape by Gmsh</w:t>
+      </w:r>
+      <w:r>
+        <w:rPr>
+          <w:rFonts w:ascii="Arial" w:hAnsi="Arial" w:eastAsia="Arial" w:cs="Arial"/>
+          <w:b w:val="0"/>
+          <w:i w:val="0"/>
+          <w:sz w:val="22"/>
+        </w:rPr>
+        <w:t>: Element order 2nd, Maximum size 7,5 mm → Apply → OK. Python console: (App.ActiveDocument.FEMMeshGmsh.FemMesh.NodeCount, App.ActiveDocument.FEMMeshGmsh.FemMesh.VolumeCount) → 2.360 simpul, 1.166 elemen.</w:t>
       </w:r>
     </w:p>
     <w:p>
@@ -12258,7 +12420,43 @@
           <w:i w:val="0"/>
           <w:sz w:val="22"/>
         </w:rPr>
-        <w:t>Klik ganda CalculiXCcxTools → Analysis Type static → Write .inp file → Run CalculiX; tunggu “done without error”. Show result → Displacement Magnitude; baca nilai maksimum.</w:t>
+        <w:t xml:space="preserve">Solve → </w:t>
+      </w:r>
+      <w:r>
+        <w:rPr>
+          <w:rFonts w:ascii="Arial" w:hAnsi="Arial" w:eastAsia="Arial" w:cs="Arial"/>
+          <w:b/>
+          <w:i w:val="0"/>
+          <w:sz w:val="22"/>
+        </w:rPr>
+        <w:t>Solver CalculiX</w:t>
+      </w:r>
+      <w:r>
+        <w:rPr>
+          <w:rFonts w:ascii="Arial" w:hAnsi="Arial" w:eastAsia="Arial" w:cs="Arial"/>
+          <w:b w:val="0"/>
+          <w:i w:val="0"/>
+          <w:sz w:val="22"/>
+        </w:rPr>
+        <w:t xml:space="preserve">; klik ganda SolverCcxTools → Static → Write .inp File → Run CalculiX: “CalculiX done without error!” → Close. Sembunyikan Cube dan CCX_Results_Mesh (Space); pilih Pipeline_CCX_Results → View → Field = </w:t>
+      </w:r>
+      <w:r>
+        <w:rPr>
+          <w:rFonts w:ascii="Arial" w:hAnsi="Arial" w:eastAsia="Arial" w:cs="Arial"/>
+          <w:b w:val="0"/>
+          <w:i/>
+          <w:sz w:val="22"/>
+        </w:rPr>
+        <w:t>Displacement Magnitude</w:t>
+      </w:r>
+      <w:r>
+        <w:rPr>
+          <w:rFonts w:ascii="Arial" w:hAnsi="Arial" w:eastAsia="Arial" w:cs="Arial"/>
+          <w:b w:val="0"/>
+          <w:i w:val="0"/>
+          <w:sz w:val="22"/>
+        </w:rPr>
+        <w:t xml:space="preserve"> (skala warna dalam meter). round(max(App.ActiveDocument.CCX_Results.DisplacementLengths), 4) → 0,5452 mm.</w:t>
       </w:r>
     </w:p>
     <w:p>
@@ -12291,7 +12489,7 @@
           <w:i w:val="0"/>
           <w:sz w:val="22"/>
         </w:rPr>
-        <w:t>δ rumus = 0,5486 mm, σ rumus = 80,0 MPa. Hitung kesalahan relatif; ulangi dengan mesh 5 dan 2,5 mm sampai perubahan &lt; 2%. Coba Element Order 1st sekali untuk melihat tet4 yang terlalu kaku.</w:t>
+        <w:t>δ rumus = 0,5486 mm, σ rumus = 80,0 MPa. Klik ganda FEMMeshGmsh → Maximum size 5 → Apply → OK, jalankan solver lagi: 3.885 elemen, δ = 0,546 mm; 2,5 mm: 27.152 elemen, δ = 0,5464 mm (kesalahan 0,4 % terhadap rumus, perubahan antar-mesh &lt; 0,1 %). Coba Element order 1st (tet4) 7,5 mm sekali: δ = 0,2958 mm, terlalu kaku. Kembalikan ke 2nd, 5 mm.</w:t>
       </w:r>
     </w:p>
     <w:p>
@@ -12324,7 +12522,61 @@
           <w:i w:val="0"/>
           <w:sz w:val="22"/>
         </w:rPr>
-        <w:t>Ganti beban dengan Temperature 380 K di muka x = 0 dan 300 K di muka x = L, + Initial temperature 300 K, Analysis Type thermomech (steady) → baca Temperature; lalu frequency (hapus constraint suhu) → f₁ ≈ 386,8 Hz. Ctrl+S → Latihan8_NIM.FCStd.</w:t>
+        <w:t xml:space="preserve">Tampilkan Cube, hapus ConstraintForce. Thermal Boundary Conditions and Loads → </w:t>
+      </w:r>
+      <w:r>
+        <w:rPr>
+          <w:rFonts w:ascii="Arial" w:hAnsi="Arial" w:eastAsia="Arial" w:cs="Arial"/>
+          <w:b/>
+          <w:i w:val="0"/>
+          <w:sz w:val="22"/>
+        </w:rPr>
+        <w:t>Temperature Boundary Condition</w:t>
+      </w:r>
+      <w:r>
+        <w:rPr>
+          <w:rFonts w:ascii="Arial" w:hAnsi="Arial" w:eastAsia="Arial" w:cs="Arial"/>
+          <w:b w:val="0"/>
+          <w:i w:val="0"/>
+          <w:sz w:val="22"/>
+        </w:rPr>
+        <w:t xml:space="preserve"> 380 K di muka x = 0 dan 300 K di muka x = L, + Initial Temperature 300 K; solver </w:t>
+      </w:r>
+      <w:r>
+        <w:rPr>
+          <w:rFonts w:ascii="Arial" w:hAnsi="Arial" w:eastAsia="Arial" w:cs="Arial"/>
+          <w:b w:val="0"/>
+          <w:i/>
+          <w:sz w:val="22"/>
+        </w:rPr>
+        <w:t>Thermo mechanical</w:t>
+      </w:r>
+      <w:r>
+        <w:rPr>
+          <w:rFonts w:ascii="Arial" w:hAnsi="Arial" w:eastAsia="Arial" w:cs="Arial"/>
+          <w:b w:val="0"/>
+          <w:i w:val="0"/>
+          <w:sz w:val="22"/>
+        </w:rPr>
+        <w:t xml:space="preserve"> → Temperature 300–380 K (Pipeline Field = Temperature). Results → Purge Results, hapus kedua constraint suhu (Fixed tetap), SolverCcxTools → Data → Eigenmodes Count 5, solver </w:t>
+      </w:r>
+      <w:r>
+        <w:rPr>
+          <w:rFonts w:ascii="Arial" w:hAnsi="Arial" w:eastAsia="Arial" w:cs="Arial"/>
+          <w:b w:val="0"/>
+          <w:i/>
+          <w:sz w:val="22"/>
+        </w:rPr>
+        <w:t>Frequency</w:t>
+      </w:r>
+      <w:r>
+        <w:rPr>
+          <w:rFonts w:ascii="Arial" w:hAnsi="Arial" w:eastAsia="Arial" w:cs="Arial"/>
+          <w:b w:val="0"/>
+          <w:i w:val="0"/>
+          <w:sz w:val="22"/>
+        </w:rPr>
+        <w:t xml:space="preserve"> → f₁ = 387,8 Hz (rumus ≈ 386,8 Hz), f₂ = 761,3 Hz, f₃ = 2.355,7 Hz. Ctrl+S → Latihan8_NIM.FCStd.</w:t>
       </w:r>
     </w:p>
     <w:p>
@@ -12930,7 +13182,7 @@
           <w:i w:val="0"/>
           <w:sz w:val="21"/>
         </w:rPr>
-        <w:t xml:space="preserve"> (1) satu Analysis berisi MaterialSolid (properti terisi), FEMMeshGmsh orde 2, constraint sesuai tugas, dan CalculiXCcxTools dengan Analysis Type yang benar; (2) hasil CCX_Results (atau CCX_Mode1_Results) ada di pohon setelah Run; (3) angka yang diisikan adalah nilai ANALITIS dengan desimal sesuai label, dihitung dari dimensi varian Anda; (4) selisih FEM terhadap rumus sudah Anda periksa (&lt; 5%); (5) berkas .FCStd tersimpan lewat Ctrl+S, nama tanpa spasi.</w:t>
+        <w:t xml:space="preserve"> (1) satu Analysis berisi MaterialSolid (properti terisi), FEMMeshGmsh orde 2, constraint sesuai tugas, dan SolverCcxTools dengan Analysis Type yang benar; (2) hasil CCX_Results (atau CCX_EigenMode_1_Results) ada di pohon setelah Run; (3) angka yang diisikan adalah nilai ANALITIS dengan desimal sesuai label, dihitung dari dimensi varian Anda; (4) selisih FEM terhadap rumus sudah Anda periksa (&lt; 5%); (5) berkas .FCStd tersimpan lewat Ctrl+S, nama tanpa spasi.</w:t>
       </w:r>
     </w:p>
     <w:p>

</xml_diff>